<commit_message>
Fix cart build issue and route fixes
</commit_message>
<xml_diff>
--- a/misc.docx
+++ b/misc.docx
@@ -3,10 +3,35 @@
 <w:document xmlns:ve="http://schemas.openxmlformats.org/markup-compatibility/2006" xmlns:o="urn:schemas-microsoft-com:office:office" xmlns:r="http://schemas.openxmlformats.org/officeDocument/2006/relationships" xmlns:m="http://schemas.openxmlformats.org/officeDocument/2006/math" xmlns:v="urn:schemas-microsoft-com:vml" xmlns:wp="http://schemas.openxmlformats.org/drawingml/2006/wordprocessingDrawing" xmlns:w10="urn:schemas-microsoft-com:office:word" xmlns:w="http://schemas.openxmlformats.org/wordprocessingml/2006/main" xmlns:wne="http://schemas.microsoft.com/office/word/2006/wordml">
   <w:body>
     <w:p>
+      <w:hyperlink r:id="rId4" w:history="1">
+        <w:r>
+          <w:rPr>
+            <w:rStyle w:val="Hyperlink"/>
+          </w:rPr>
+          <w:t>https://yogi-wmzp.vercel.app/admin-login</w:t>
+        </w:r>
+      </w:hyperlink>
+    </w:p>
+    <w:p/>
+    <w:p>
       <w:r>
-        <w:t>https://yogi-wmzp.vercel.app/admin-login</w:t>
+        <w:t>WELCOME10 → 10% discount</w:t>
+      </w:r>
+      <w:r>
+        <w:br/>
+        <w:t>YOGI20 → 20% discount</w:t>
+      </w:r>
+      <w:r>
+        <w:br/>
+        <w:t>FESTIVE25 → 25% discount</w:t>
+      </w:r>
+      <w:r>
+        <w:br/>
+        <w:t>SAVE100 → 100 off</w:t>
       </w:r>
     </w:p>
+    <w:p/>
+    <w:p/>
     <w:sectPr>
       <w:pgSz w:w="12240" w:h="15840"/>
       <w:pgMar w:top="1440" w:right="1440" w:bottom="1440" w:left="1440" w:header="720" w:footer="720" w:gutter="0"/>
@@ -175,6 +200,7 @@
   <w:style w:type="paragraph" w:default="1" w:styleId="Normal">
     <w:name w:val="Normal"/>
     <w:qFormat/>
+    <w:rsid w:val="00C67AB2"/>
   </w:style>
   <w:style w:type="character" w:default="1" w:styleId="DefaultParagraphFont">
     <w:name w:val="Default Paragraph Font"/>
@@ -203,6 +229,17 @@
     <w:uiPriority w:val="99"/>
     <w:semiHidden/>
     <w:unhideWhenUsed/>
+  </w:style>
+  <w:style w:type="character" w:styleId="Hyperlink">
+    <w:name w:val="Hyperlink"/>
+    <w:basedOn w:val="DefaultParagraphFont"/>
+    <w:uiPriority w:val="99"/>
+    <w:unhideWhenUsed/>
+    <w:rsid w:val="001F3126"/>
+    <w:rPr>
+      <w:color w:val="0000FF" w:themeColor="hyperlink"/>
+      <w:u w:val="single"/>
+    </w:rPr>
   </w:style>
 </w:styles>
 </file>

</xml_diff>

<commit_message>
UI improvements homepage and product cards
</commit_message>
<xml_diff>
--- a/misc.docx
+++ b/misc.docx
@@ -3,14 +3,24 @@
 <w:document xmlns:ve="http://schemas.openxmlformats.org/markup-compatibility/2006" xmlns:o="urn:schemas-microsoft-com:office:office" xmlns:r="http://schemas.openxmlformats.org/officeDocument/2006/relationships" xmlns:m="http://schemas.openxmlformats.org/officeDocument/2006/math" xmlns:v="urn:schemas-microsoft-com:vml" xmlns:wp="http://schemas.openxmlformats.org/drawingml/2006/wordprocessingDrawing" xmlns:w10="urn:schemas-microsoft-com:office:word" xmlns:w="http://schemas.openxmlformats.org/wordprocessingml/2006/main" xmlns:wne="http://schemas.microsoft.com/office/word/2006/wordml">
   <w:body>
     <w:p>
-      <w:hyperlink r:id="rId4" w:history="1">
-        <w:r>
-          <w:rPr>
-            <w:rStyle w:val="Hyperlink"/>
-          </w:rPr>
-          <w:t>https://yogi-wmzp.vercel.app/admin-login</w:t>
-        </w:r>
-      </w:hyperlink>
+      <w:r>
+        <w:fldChar w:fldCharType="begin"/>
+      </w:r>
+      <w:r>
+        <w:instrText>HYPERLINK "https://yogi-wmzp.vercel.app/admin-login"</w:instrText>
+      </w:r>
+      <w:r>
+        <w:fldChar w:fldCharType="separate"/>
+      </w:r>
+      <w:r>
+        <w:rPr>
+          <w:rStyle w:val="Hyperlink"/>
+        </w:rPr>
+        <w:t>https://yogi-wmzp.vercel.app/admin-login</w:t>
+      </w:r>
+      <w:r>
+        <w:fldChar w:fldCharType="end"/>
+      </w:r>
     </w:p>
     <w:p/>
     <w:p>
@@ -29,6 +39,366 @@
         <w:br/>
         <w:t>SAVE100 → 100 off</w:t>
       </w:r>
+    </w:p>
+    <w:p/>
+    <w:p/>
+    <w:p>
+      <w:pPr>
+        <w:spacing w:before="100" w:beforeAutospacing="1" w:after="100" w:afterAutospacing="1" w:line="240" w:lineRule="auto"/>
+        <w:rPr>
+          <w:rFonts w:ascii="Times New Roman" w:eastAsia="Times New Roman" w:hAnsi="Times New Roman" w:cs="Times New Roman"/>
+          <w:sz w:val="24"/>
+          <w:szCs w:val="24"/>
+        </w:rPr>
+      </w:pPr>
+      <w:proofErr w:type="gramStart"/>
+      <w:r>
+        <w:rPr>
+          <w:rFonts w:ascii="Times New Roman" w:eastAsia="Times New Roman" w:hAnsi="Times New Roman" w:cs="Times New Roman"/>
+          <w:sz w:val="24"/>
+          <w:szCs w:val="24"/>
+        </w:rPr>
+        <w:t>especially</w:t>
+      </w:r>
+      <w:proofErr w:type="gramEnd"/>
+      <w:r>
+        <w:rPr>
+          <w:rFonts w:ascii="Times New Roman" w:eastAsia="Times New Roman" w:hAnsi="Times New Roman" w:cs="Times New Roman"/>
+          <w:sz w:val="24"/>
+          <w:szCs w:val="24"/>
+        </w:rPr>
+        <w:t xml:space="preserve"> the section order, for example:</w:t>
+      </w:r>
+    </w:p>
+    <w:p>
+      <w:pPr>
+        <w:tabs>
+          <w:tab w:val="left" w:pos="916"/>
+          <w:tab w:val="left" w:pos="1832"/>
+          <w:tab w:val="left" w:pos="2748"/>
+          <w:tab w:val="left" w:pos="3664"/>
+          <w:tab w:val="left" w:pos="4580"/>
+          <w:tab w:val="left" w:pos="5496"/>
+          <w:tab w:val="left" w:pos="6412"/>
+          <w:tab w:val="left" w:pos="7328"/>
+          <w:tab w:val="left" w:pos="8244"/>
+          <w:tab w:val="left" w:pos="9160"/>
+          <w:tab w:val="left" w:pos="10076"/>
+          <w:tab w:val="left" w:pos="10992"/>
+          <w:tab w:val="left" w:pos="11908"/>
+          <w:tab w:val="left" w:pos="12824"/>
+          <w:tab w:val="left" w:pos="13740"/>
+          <w:tab w:val="left" w:pos="14656"/>
+        </w:tabs>
+        <w:spacing w:after="0" w:line="240" w:lineRule="auto"/>
+        <w:rPr>
+          <w:rFonts w:ascii="Courier New" w:eastAsia="Times New Roman" w:hAnsi="Courier New" w:cs="Courier New"/>
+          <w:sz w:val="20"/>
+        </w:rPr>
+      </w:pPr>
+      <w:r>
+        <w:rPr>
+          <w:rFonts w:ascii="Courier New" w:eastAsia="Times New Roman" w:hAnsi="Courier New" w:cs="Courier New"/>
+          <w:sz w:val="20"/>
+        </w:rPr>
+        <w:t>&lt;Hero /&gt;</w:t>
+      </w:r>
+      <w:r>
+        <w:rPr>
+          <w:rFonts w:ascii="Courier New" w:eastAsia="Times New Roman" w:hAnsi="Courier New" w:cs="Courier New"/>
+          <w:sz w:val="20"/>
+        </w:rPr>
+        <w:br/>
+        <w:t>&lt;</w:t>
+      </w:r>
+      <w:proofErr w:type="spellStart"/>
+      <w:r>
+        <w:rPr>
+          <w:rFonts w:ascii="Courier New" w:eastAsia="Times New Roman" w:hAnsi="Courier New" w:cs="Courier New"/>
+          <w:sz w:val="20"/>
+        </w:rPr>
+        <w:t>CategoryStrip</w:t>
+      </w:r>
+      <w:proofErr w:type="spellEnd"/>
+      <w:r>
+        <w:rPr>
+          <w:rFonts w:ascii="Courier New" w:eastAsia="Times New Roman" w:hAnsi="Courier New" w:cs="Courier New"/>
+          <w:sz w:val="20"/>
+        </w:rPr>
+        <w:t xml:space="preserve"> /&gt;</w:t>
+      </w:r>
+      <w:r>
+        <w:rPr>
+          <w:rFonts w:ascii="Courier New" w:eastAsia="Times New Roman" w:hAnsi="Courier New" w:cs="Courier New"/>
+          <w:sz w:val="20"/>
+        </w:rPr>
+        <w:br/>
+        <w:t>&lt;</w:t>
+      </w:r>
+      <w:proofErr w:type="spellStart"/>
+      <w:r>
+        <w:rPr>
+          <w:rFonts w:ascii="Courier New" w:eastAsia="Times New Roman" w:hAnsi="Courier New" w:cs="Courier New"/>
+          <w:sz w:val="20"/>
+        </w:rPr>
+        <w:t>FeaturedProducts</w:t>
+      </w:r>
+      <w:proofErr w:type="spellEnd"/>
+      <w:r>
+        <w:rPr>
+          <w:rFonts w:ascii="Courier New" w:eastAsia="Times New Roman" w:hAnsi="Courier New" w:cs="Courier New"/>
+          <w:sz w:val="20"/>
+        </w:rPr>
+        <w:t xml:space="preserve"> /&gt;</w:t>
+      </w:r>
+      <w:r>
+        <w:rPr>
+          <w:rFonts w:ascii="Courier New" w:eastAsia="Times New Roman" w:hAnsi="Courier New" w:cs="Courier New"/>
+          <w:sz w:val="20"/>
+        </w:rPr>
+        <w:br/>
+        <w:t>&lt;</w:t>
+      </w:r>
+      <w:proofErr w:type="spellStart"/>
+      <w:r>
+        <w:rPr>
+          <w:rFonts w:ascii="Courier New" w:eastAsia="Times New Roman" w:hAnsi="Courier New" w:cs="Courier New"/>
+          <w:sz w:val="20"/>
+        </w:rPr>
+        <w:t>FlashSale</w:t>
+      </w:r>
+      <w:proofErr w:type="spellEnd"/>
+      <w:r>
+        <w:rPr>
+          <w:rFonts w:ascii="Courier New" w:eastAsia="Times New Roman" w:hAnsi="Courier New" w:cs="Courier New"/>
+          <w:sz w:val="20"/>
+        </w:rPr>
+        <w:t xml:space="preserve"> /&gt;</w:t>
+      </w:r>
+      <w:r>
+        <w:rPr>
+          <w:rFonts w:ascii="Courier New" w:eastAsia="Times New Roman" w:hAnsi="Courier New" w:cs="Courier New"/>
+          <w:sz w:val="20"/>
+        </w:rPr>
+        <w:br/>
+        <w:t>&lt;</w:t>
+      </w:r>
+      <w:proofErr w:type="spellStart"/>
+      <w:r>
+        <w:rPr>
+          <w:rFonts w:ascii="Courier New" w:eastAsia="Times New Roman" w:hAnsi="Courier New" w:cs="Courier New"/>
+          <w:sz w:val="20"/>
+        </w:rPr>
+        <w:t>TrendingProducts</w:t>
+      </w:r>
+      <w:proofErr w:type="spellEnd"/>
+      <w:r>
+        <w:rPr>
+          <w:rFonts w:ascii="Courier New" w:eastAsia="Times New Roman" w:hAnsi="Courier New" w:cs="Courier New"/>
+          <w:sz w:val="20"/>
+        </w:rPr>
+        <w:t xml:space="preserve"> /&gt;</w:t>
+      </w:r>
+      <w:r>
+        <w:rPr>
+          <w:rFonts w:ascii="Courier New" w:eastAsia="Times New Roman" w:hAnsi="Courier New" w:cs="Courier New"/>
+          <w:sz w:val="20"/>
+        </w:rPr>
+        <w:br/>
+        <w:t>&lt;</w:t>
+      </w:r>
+      <w:proofErr w:type="spellStart"/>
+      <w:r>
+        <w:rPr>
+          <w:rFonts w:ascii="Courier New" w:eastAsia="Times New Roman" w:hAnsi="Courier New" w:cs="Courier New"/>
+          <w:sz w:val="20"/>
+        </w:rPr>
+        <w:t>BestSellers</w:t>
+      </w:r>
+      <w:proofErr w:type="spellEnd"/>
+      <w:r>
+        <w:rPr>
+          <w:rFonts w:ascii="Courier New" w:eastAsia="Times New Roman" w:hAnsi="Courier New" w:cs="Courier New"/>
+          <w:sz w:val="20"/>
+        </w:rPr>
+        <w:t xml:space="preserve"> /&gt;</w:t>
+      </w:r>
+      <w:r>
+        <w:rPr>
+          <w:rFonts w:ascii="Courier New" w:eastAsia="Times New Roman" w:hAnsi="Courier New" w:cs="Courier New"/>
+          <w:sz w:val="20"/>
+        </w:rPr>
+        <w:br/>
+        <w:t>&lt;</w:t>
+      </w:r>
+      <w:proofErr w:type="spellStart"/>
+      <w:r>
+        <w:rPr>
+          <w:rFonts w:ascii="Courier New" w:eastAsia="Times New Roman" w:hAnsi="Courier New" w:cs="Courier New"/>
+          <w:sz w:val="20"/>
+        </w:rPr>
+        <w:t>RecommendedProducts</w:t>
+      </w:r>
+      <w:proofErr w:type="spellEnd"/>
+      <w:r>
+        <w:rPr>
+          <w:rFonts w:ascii="Courier New" w:eastAsia="Times New Roman" w:hAnsi="Courier New" w:cs="Courier New"/>
+          <w:sz w:val="20"/>
+        </w:rPr>
+        <w:t xml:space="preserve"> /&gt;</w:t>
+      </w:r>
+      <w:r>
+        <w:rPr>
+          <w:rFonts w:ascii="Courier New" w:eastAsia="Times New Roman" w:hAnsi="Courier New" w:cs="Courier New"/>
+          <w:sz w:val="20"/>
+        </w:rPr>
+        <w:br/>
+        <w:t>&lt;</w:t>
+      </w:r>
+      <w:proofErr w:type="spellStart"/>
+      <w:r>
+        <w:rPr>
+          <w:rFonts w:ascii="Courier New" w:eastAsia="Times New Roman" w:hAnsi="Courier New" w:cs="Courier New"/>
+          <w:sz w:val="20"/>
+        </w:rPr>
+        <w:t>TopVendors</w:t>
+      </w:r>
+      <w:proofErr w:type="spellEnd"/>
+      <w:r>
+        <w:rPr>
+          <w:rFonts w:ascii="Courier New" w:eastAsia="Times New Roman" w:hAnsi="Courier New" w:cs="Courier New"/>
+          <w:sz w:val="20"/>
+        </w:rPr>
+        <w:t xml:space="preserve"> /&gt;</w:t>
+      </w:r>
+    </w:p>
+    <w:p>
+      <w:pPr>
+        <w:spacing w:before="100" w:beforeAutospacing="1" w:after="100" w:afterAutospacing="1" w:line="240" w:lineRule="auto"/>
+        <w:rPr>
+          <w:rFonts w:ascii="Times New Roman" w:eastAsia="Times New Roman" w:hAnsi="Times New Roman" w:cs="Times New Roman"/>
+          <w:sz w:val="24"/>
+          <w:szCs w:val="24"/>
+        </w:rPr>
+      </w:pPr>
+      <w:r>
+        <w:rPr>
+          <w:rFonts w:ascii="Times New Roman" w:eastAsia="Times New Roman" w:hAnsi="Times New Roman" w:cs="Times New Roman"/>
+          <w:sz w:val="24"/>
+          <w:szCs w:val="24"/>
+        </w:rPr>
+        <w:t xml:space="preserve">Then I'll tell you exactly which </w:t>
+      </w:r>
+      <w:proofErr w:type="spellStart"/>
+      <w:r>
+        <w:rPr>
+          <w:rFonts w:ascii="Courier New" w:eastAsia="Times New Roman" w:hAnsi="Courier New" w:cs="Courier New"/>
+          <w:sz w:val="20"/>
+        </w:rPr>
+        <w:t>py</w:t>
+      </w:r>
+      <w:proofErr w:type="spellEnd"/>
+      <w:r>
+        <w:rPr>
+          <w:rFonts w:ascii="Courier New" w:eastAsia="Times New Roman" w:hAnsi="Courier New" w:cs="Courier New"/>
+          <w:sz w:val="20"/>
+        </w:rPr>
+        <w:t>-*</w:t>
+      </w:r>
+      <w:r>
+        <w:rPr>
+          <w:rFonts w:ascii="Times New Roman" w:eastAsia="Times New Roman" w:hAnsi="Times New Roman" w:cs="Times New Roman"/>
+          <w:sz w:val="24"/>
+          <w:szCs w:val="24"/>
+        </w:rPr>
+        <w:t xml:space="preserve">, </w:t>
+      </w:r>
+      <w:proofErr w:type="spellStart"/>
+      <w:r>
+        <w:rPr>
+          <w:rFonts w:ascii="Courier New" w:eastAsia="Times New Roman" w:hAnsi="Courier New" w:cs="Courier New"/>
+          <w:sz w:val="20"/>
+        </w:rPr>
+        <w:t>mt</w:t>
+      </w:r>
+      <w:proofErr w:type="spellEnd"/>
+      <w:r>
+        <w:rPr>
+          <w:rFonts w:ascii="Courier New" w:eastAsia="Times New Roman" w:hAnsi="Courier New" w:cs="Courier New"/>
+          <w:sz w:val="20"/>
+        </w:rPr>
+        <w:t>-*</w:t>
+      </w:r>
+      <w:r>
+        <w:rPr>
+          <w:rFonts w:ascii="Times New Roman" w:eastAsia="Times New Roman" w:hAnsi="Times New Roman" w:cs="Times New Roman"/>
+          <w:sz w:val="24"/>
+          <w:szCs w:val="24"/>
+        </w:rPr>
+        <w:t xml:space="preserve">, </w:t>
+      </w:r>
+      <w:proofErr w:type="spellStart"/>
+      <w:r>
+        <w:rPr>
+          <w:rFonts w:ascii="Courier New" w:eastAsia="Times New Roman" w:hAnsi="Courier New" w:cs="Courier New"/>
+          <w:sz w:val="20"/>
+        </w:rPr>
+        <w:t>mb</w:t>
+      </w:r>
+      <w:proofErr w:type="spellEnd"/>
+      <w:r>
+        <w:rPr>
+          <w:rFonts w:ascii="Courier New" w:eastAsia="Times New Roman" w:hAnsi="Courier New" w:cs="Courier New"/>
+          <w:sz w:val="20"/>
+        </w:rPr>
+        <w:t>-*</w:t>
+      </w:r>
+      <w:r>
+        <w:rPr>
+          <w:rFonts w:ascii="Times New Roman" w:eastAsia="Times New Roman" w:hAnsi="Times New Roman" w:cs="Times New Roman"/>
+          <w:sz w:val="24"/>
+          <w:szCs w:val="24"/>
+        </w:rPr>
+        <w:t xml:space="preserve">, </w:t>
+      </w:r>
+      <w:r>
+        <w:rPr>
+          <w:rFonts w:ascii="Courier New" w:eastAsia="Times New Roman" w:hAnsi="Courier New" w:cs="Courier New"/>
+          <w:sz w:val="20"/>
+        </w:rPr>
+        <w:t>gap-*</w:t>
+      </w:r>
+      <w:r>
+        <w:rPr>
+          <w:rFonts w:ascii="Times New Roman" w:eastAsia="Times New Roman" w:hAnsi="Times New Roman" w:cs="Times New Roman"/>
+          <w:sz w:val="24"/>
+          <w:szCs w:val="24"/>
+        </w:rPr>
+        <w:t xml:space="preserve">, or </w:t>
+      </w:r>
+      <w:r>
+        <w:rPr>
+          <w:rFonts w:ascii="Courier New" w:eastAsia="Times New Roman" w:hAnsi="Courier New" w:cs="Courier New"/>
+          <w:sz w:val="20"/>
+        </w:rPr>
+        <w:t>space-y-*</w:t>
+      </w:r>
+      <w:r>
+        <w:rPr>
+          <w:rFonts w:ascii="Times New Roman" w:eastAsia="Times New Roman" w:hAnsi="Times New Roman" w:cs="Times New Roman"/>
+          <w:sz w:val="24"/>
+          <w:szCs w:val="24"/>
+        </w:rPr>
+        <w:t xml:space="preserve"> classes to change so the gap between sections becomes zero (or nearly zero).</w:t>
+      </w:r>
+    </w:p>
+    <w:p>
+      <w:pPr>
+        <w:rPr>
+          <w:b/>
+          <w:bCs/>
+        </w:rPr>
+      </w:pPr>
     </w:p>
     <w:p/>
     <w:p/>
@@ -241,6 +611,96 @@
       <w:u w:val="single"/>
     </w:rPr>
   </w:style>
+  <w:style w:type="paragraph" w:styleId="NormalWeb">
+    <w:name w:val="Normal (Web)"/>
+    <w:basedOn w:val="Normal"/>
+    <w:uiPriority w:val="99"/>
+    <w:semiHidden/>
+    <w:unhideWhenUsed/>
+    <w:rsid w:val="00986438"/>
+    <w:pPr>
+      <w:spacing w:before="100" w:beforeAutospacing="1" w:after="100" w:afterAutospacing="1" w:line="240" w:lineRule="auto"/>
+    </w:pPr>
+    <w:rPr>
+      <w:rFonts w:ascii="Times New Roman" w:eastAsia="Times New Roman" w:hAnsi="Times New Roman" w:cs="Times New Roman"/>
+      <w:sz w:val="24"/>
+      <w:szCs w:val="24"/>
+    </w:rPr>
+  </w:style>
+  <w:style w:type="paragraph" w:styleId="HTMLPreformatted">
+    <w:name w:val="HTML Preformatted"/>
+    <w:basedOn w:val="Normal"/>
+    <w:link w:val="HTMLPreformattedChar"/>
+    <w:uiPriority w:val="99"/>
+    <w:semiHidden/>
+    <w:unhideWhenUsed/>
+    <w:rsid w:val="00986438"/>
+    <w:pPr>
+      <w:tabs>
+        <w:tab w:val="left" w:pos="916"/>
+        <w:tab w:val="left" w:pos="1832"/>
+        <w:tab w:val="left" w:pos="2748"/>
+        <w:tab w:val="left" w:pos="3664"/>
+        <w:tab w:val="left" w:pos="4580"/>
+        <w:tab w:val="left" w:pos="5496"/>
+        <w:tab w:val="left" w:pos="6412"/>
+        <w:tab w:val="left" w:pos="7328"/>
+        <w:tab w:val="left" w:pos="8244"/>
+        <w:tab w:val="left" w:pos="9160"/>
+        <w:tab w:val="left" w:pos="10076"/>
+        <w:tab w:val="left" w:pos="10992"/>
+        <w:tab w:val="left" w:pos="11908"/>
+        <w:tab w:val="left" w:pos="12824"/>
+        <w:tab w:val="left" w:pos="13740"/>
+        <w:tab w:val="left" w:pos="14656"/>
+      </w:tabs>
+      <w:spacing w:after="0" w:line="240" w:lineRule="auto"/>
+    </w:pPr>
+    <w:rPr>
+      <w:rFonts w:ascii="Courier New" w:eastAsia="Times New Roman" w:hAnsi="Courier New" w:cs="Courier New"/>
+      <w:sz w:val="20"/>
+    </w:rPr>
+  </w:style>
+  <w:style w:type="character" w:customStyle="1" w:styleId="HTMLPreformattedChar">
+    <w:name w:val="HTML Preformatted Char"/>
+    <w:basedOn w:val="DefaultParagraphFont"/>
+    <w:link w:val="HTMLPreformatted"/>
+    <w:uiPriority w:val="99"/>
+    <w:semiHidden/>
+    <w:rsid w:val="00986438"/>
+    <w:rPr>
+      <w:rFonts w:ascii="Courier New" w:eastAsia="Times New Roman" w:hAnsi="Courier New" w:cs="Courier New"/>
+      <w:sz w:val="20"/>
+    </w:rPr>
+  </w:style>
+  <w:style w:type="character" w:styleId="HTMLCode">
+    <w:name w:val="HTML Code"/>
+    <w:basedOn w:val="DefaultParagraphFont"/>
+    <w:uiPriority w:val="99"/>
+    <w:semiHidden/>
+    <w:unhideWhenUsed/>
+    <w:rsid w:val="00986438"/>
+    <w:rPr>
+      <w:rFonts w:ascii="Courier New" w:eastAsia="Times New Roman" w:hAnsi="Courier New" w:cs="Courier New"/>
+      <w:sz w:val="20"/>
+      <w:szCs w:val="20"/>
+    </w:rPr>
+  </w:style>
+  <w:style w:type="character" w:customStyle="1" w:styleId="o">
+    <w:name w:val="ͼo"/>
+    <w:basedOn w:val="DefaultParagraphFont"/>
+    <w:rsid w:val="00986438"/>
+  </w:style>
+  <w:style w:type="character" w:customStyle="1" w:styleId="g">
+    <w:name w:val="ͼg"/>
+    <w:basedOn w:val="DefaultParagraphFont"/>
+    <w:rsid w:val="00986438"/>
+  </w:style>
+  <w:style w:type="character" w:customStyle="1" w:styleId="m">
+    <w:name w:val="ͼm"/>
+    <w:basedOn w:val="DefaultParagraphFont"/>
+    <w:rsid w:val="00986438"/>
+  </w:style>
 </w:styles>
 </file>
 

</xml_diff>

<commit_message>
Completed real-time notification system for customer seller and admin
</commit_message>
<xml_diff>
--- a/misc.docx
+++ b/misc.docx
@@ -2408,6 +2408,2226 @@
           <w:bCs/>
         </w:rPr>
       </w:pPr>
+    </w:p>
+    <w:p/>
+    <w:p/>
+    <w:p/>
+    <w:p/>
+    <w:p/>
+    <w:p/>
+    <w:p/>
+    <w:p/>
+    <w:p/>
+    <w:p/>
+    <w:p/>
+    <w:p/>
+    <w:p/>
+    <w:p/>
+    <w:p/>
+    <w:p/>
+    <w:p/>
+    <w:p>
+      <w:proofErr w:type="spellStart"/>
+      <w:r>
+        <w:lastRenderedPageBreak/>
+        <w:t>rules_version</w:t>
+      </w:r>
+      <w:proofErr w:type="spellEnd"/>
+      <w:r>
+        <w:t xml:space="preserve"> = '2';</w:t>
+      </w:r>
+    </w:p>
+    <w:p>
+      <w:proofErr w:type="gramStart"/>
+      <w:r>
+        <w:t>service</w:t>
+      </w:r>
+      <w:proofErr w:type="gramEnd"/>
+      <w:r>
+        <w:t xml:space="preserve"> </w:t>
+      </w:r>
+      <w:proofErr w:type="spellStart"/>
+      <w:r>
+        <w:t>cloud.firestore</w:t>
+      </w:r>
+      <w:proofErr w:type="spellEnd"/>
+      <w:r>
+        <w:t xml:space="preserve"> {</w:t>
+      </w:r>
+    </w:p>
+    <w:p>
+      <w:r>
+        <w:t xml:space="preserve">  </w:t>
+      </w:r>
+      <w:proofErr w:type="gramStart"/>
+      <w:r>
+        <w:t>match</w:t>
+      </w:r>
+      <w:proofErr w:type="gramEnd"/>
+      <w:r>
+        <w:t xml:space="preserve"> /databases/{database}/documents {</w:t>
+      </w:r>
+    </w:p>
+    <w:p/>
+    <w:p>
+      <w:r>
+        <w:t xml:space="preserve">    // ---------- helpers ----------</w:t>
+      </w:r>
+    </w:p>
+    <w:p>
+      <w:r>
+        <w:t xml:space="preserve">    </w:t>
+      </w:r>
+      <w:proofErr w:type="gramStart"/>
+      <w:r>
+        <w:t>function</w:t>
+      </w:r>
+      <w:proofErr w:type="gramEnd"/>
+      <w:r>
+        <w:t xml:space="preserve"> </w:t>
+      </w:r>
+      <w:proofErr w:type="spellStart"/>
+      <w:r>
+        <w:t>signedIn</w:t>
+      </w:r>
+      <w:proofErr w:type="spellEnd"/>
+      <w:r>
+        <w:t>() {</w:t>
+      </w:r>
+    </w:p>
+    <w:p>
+      <w:r>
+        <w:t xml:space="preserve">      </w:t>
+      </w:r>
+      <w:proofErr w:type="gramStart"/>
+      <w:r>
+        <w:t>return</w:t>
+      </w:r>
+      <w:proofErr w:type="gramEnd"/>
+      <w:r>
+        <w:t xml:space="preserve"> </w:t>
+      </w:r>
+      <w:proofErr w:type="spellStart"/>
+      <w:r>
+        <w:t>request.auth</w:t>
+      </w:r>
+      <w:proofErr w:type="spellEnd"/>
+      <w:r>
+        <w:t xml:space="preserve"> != null;</w:t>
+      </w:r>
+    </w:p>
+    <w:p>
+      <w:r>
+        <w:t xml:space="preserve">    }</w:t>
+      </w:r>
+    </w:p>
+    <w:p/>
+    <w:p>
+      <w:r>
+        <w:t xml:space="preserve">    // TODO: replace with a custom claim (</w:t>
+      </w:r>
+      <w:proofErr w:type="spellStart"/>
+      <w:r>
+        <w:t>request.auth.token.admin</w:t>
+      </w:r>
+      <w:proofErr w:type="spellEnd"/>
+      <w:r>
+        <w:t xml:space="preserve"> == true)</w:t>
+      </w:r>
+    </w:p>
+    <w:p>
+      <w:r>
+        <w:t xml:space="preserve">    // before launch. Email check is a stopgap that matches your current app.</w:t>
+      </w:r>
+    </w:p>
+    <w:p>
+      <w:r>
+        <w:t xml:space="preserve">    </w:t>
+      </w:r>
+      <w:proofErr w:type="gramStart"/>
+      <w:r>
+        <w:t>function</w:t>
+      </w:r>
+      <w:proofErr w:type="gramEnd"/>
+      <w:r>
+        <w:t xml:space="preserve"> </w:t>
+      </w:r>
+      <w:proofErr w:type="spellStart"/>
+      <w:r>
+        <w:t>isAdmin</w:t>
+      </w:r>
+      <w:proofErr w:type="spellEnd"/>
+      <w:r>
+        <w:t>() {</w:t>
+      </w:r>
+    </w:p>
+    <w:p>
+      <w:r>
+        <w:t xml:space="preserve">      </w:t>
+      </w:r>
+      <w:proofErr w:type="gramStart"/>
+      <w:r>
+        <w:t>return</w:t>
+      </w:r>
+      <w:proofErr w:type="gramEnd"/>
+      <w:r>
+        <w:t xml:space="preserve"> </w:t>
+      </w:r>
+      <w:proofErr w:type="spellStart"/>
+      <w:r>
+        <w:t>signedIn</w:t>
+      </w:r>
+      <w:proofErr w:type="spellEnd"/>
+      <w:r>
+        <w:t>() &amp;&amp;</w:t>
+      </w:r>
+    </w:p>
+    <w:p>
+      <w:r>
+        <w:t xml:space="preserve">        </w:t>
+      </w:r>
+      <w:proofErr w:type="spellStart"/>
+      <w:r>
+        <w:t>request.auth.token.email</w:t>
+      </w:r>
+      <w:proofErr w:type="spellEnd"/>
+      <w:r>
+        <w:t xml:space="preserve"> == "adminyogimart@gmail.com";</w:t>
+      </w:r>
+    </w:p>
+    <w:p>
+      <w:r>
+        <w:t xml:space="preserve">    }</w:t>
+      </w:r>
+    </w:p>
+    <w:p/>
+    <w:p>
+      <w:r>
+        <w:t xml:space="preserve">    </w:t>
+      </w:r>
+      <w:proofErr w:type="gramStart"/>
+      <w:r>
+        <w:t>function</w:t>
+      </w:r>
+      <w:proofErr w:type="gramEnd"/>
+      <w:r>
+        <w:t xml:space="preserve"> </w:t>
+      </w:r>
+      <w:proofErr w:type="spellStart"/>
+      <w:r>
+        <w:t>isEmailOwner</w:t>
+      </w:r>
+      <w:proofErr w:type="spellEnd"/>
+      <w:r>
+        <w:t>(email) {</w:t>
+      </w:r>
+    </w:p>
+    <w:p>
+      <w:r>
+        <w:t xml:space="preserve">      </w:t>
+      </w:r>
+      <w:proofErr w:type="gramStart"/>
+      <w:r>
+        <w:t>return</w:t>
+      </w:r>
+      <w:proofErr w:type="gramEnd"/>
+      <w:r>
+        <w:t xml:space="preserve"> </w:t>
+      </w:r>
+      <w:proofErr w:type="spellStart"/>
+      <w:r>
+        <w:t>signedIn</w:t>
+      </w:r>
+      <w:proofErr w:type="spellEnd"/>
+      <w:r>
+        <w:t xml:space="preserve">() &amp;&amp; </w:t>
+      </w:r>
+      <w:proofErr w:type="spellStart"/>
+      <w:r>
+        <w:t>request.auth.token.email</w:t>
+      </w:r>
+      <w:proofErr w:type="spellEnd"/>
+      <w:r>
+        <w:t xml:space="preserve"> == email;</w:t>
+      </w:r>
+    </w:p>
+    <w:p>
+      <w:r>
+        <w:t xml:space="preserve">    }</w:t>
+      </w:r>
+    </w:p>
+    <w:p/>
+    <w:p>
+      <w:r>
+        <w:t xml:space="preserve">    </w:t>
+      </w:r>
+      <w:proofErr w:type="gramStart"/>
+      <w:r>
+        <w:t>function</w:t>
+      </w:r>
+      <w:proofErr w:type="gramEnd"/>
+      <w:r>
+        <w:t xml:space="preserve"> </w:t>
+      </w:r>
+      <w:proofErr w:type="spellStart"/>
+      <w:r>
+        <w:t>isChatParticipant</w:t>
+      </w:r>
+      <w:proofErr w:type="spellEnd"/>
+      <w:r>
+        <w:t>(</w:t>
+      </w:r>
+      <w:proofErr w:type="spellStart"/>
+      <w:r>
+        <w:t>chatId</w:t>
+      </w:r>
+      <w:proofErr w:type="spellEnd"/>
+      <w:r>
+        <w:t>) {</w:t>
+      </w:r>
+    </w:p>
+    <w:p>
+      <w:r>
+        <w:t xml:space="preserve">      </w:t>
+      </w:r>
+      <w:proofErr w:type="gramStart"/>
+      <w:r>
+        <w:t>return</w:t>
+      </w:r>
+      <w:proofErr w:type="gramEnd"/>
+      <w:r>
+        <w:t xml:space="preserve"> get(/databases/$(database)/documents/chats/$(chatId)).data.customerEmail == </w:t>
+      </w:r>
+      <w:proofErr w:type="spellStart"/>
+      <w:r>
+        <w:t>request.auth.token.email</w:t>
+      </w:r>
+      <w:proofErr w:type="spellEnd"/>
+    </w:p>
+    <w:p>
+      <w:r>
+        <w:t xml:space="preserve">          || </w:t>
+      </w:r>
+      <w:proofErr w:type="gramStart"/>
+      <w:r>
+        <w:t>get(</w:t>
+      </w:r>
+      <w:proofErr w:type="gramEnd"/>
+      <w:r>
+        <w:t xml:space="preserve">/databases/$(database)/documents/chats/$(chatId)).data.sellerId == </w:t>
+      </w:r>
+      <w:proofErr w:type="spellStart"/>
+      <w:r>
+        <w:t>request.auth.uid</w:t>
+      </w:r>
+      <w:proofErr w:type="spellEnd"/>
+      <w:r>
+        <w:t>;</w:t>
+      </w:r>
+    </w:p>
+    <w:p>
+      <w:r>
+        <w:t xml:space="preserve">    }</w:t>
+      </w:r>
+    </w:p>
+    <w:p/>
+    <w:p>
+      <w:r>
+        <w:lastRenderedPageBreak/>
+        <w:t xml:space="preserve">    // ---------- products (public catalog) ----------</w:t>
+      </w:r>
+    </w:p>
+    <w:p>
+      <w:r>
+        <w:t xml:space="preserve">    </w:t>
+      </w:r>
+      <w:proofErr w:type="gramStart"/>
+      <w:r>
+        <w:t>match</w:t>
+      </w:r>
+      <w:proofErr w:type="gramEnd"/>
+      <w:r>
+        <w:t xml:space="preserve"> /products/{id} {</w:t>
+      </w:r>
+    </w:p>
+    <w:p>
+      <w:r>
+        <w:t xml:space="preserve">      </w:t>
+      </w:r>
+      <w:proofErr w:type="gramStart"/>
+      <w:r>
+        <w:t>allow</w:t>
+      </w:r>
+      <w:proofErr w:type="gramEnd"/>
+      <w:r>
+        <w:t xml:space="preserve"> read: if true;</w:t>
+      </w:r>
+    </w:p>
+    <w:p/>
+    <w:p>
+      <w:r>
+        <w:t xml:space="preserve">      </w:t>
+      </w:r>
+      <w:proofErr w:type="gramStart"/>
+      <w:r>
+        <w:t>allow</w:t>
+      </w:r>
+      <w:proofErr w:type="gramEnd"/>
+      <w:r>
+        <w:t xml:space="preserve"> create: if </w:t>
+      </w:r>
+      <w:proofErr w:type="spellStart"/>
+      <w:r>
+        <w:t>signedIn</w:t>
+      </w:r>
+      <w:proofErr w:type="spellEnd"/>
+      <w:r>
+        <w:t>()</w:t>
+      </w:r>
+    </w:p>
+    <w:p>
+      <w:r>
+        <w:t xml:space="preserve">        &amp;&amp; </w:t>
+      </w:r>
+      <w:proofErr w:type="spellStart"/>
+      <w:r>
+        <w:t>request.resource.data.vendorId</w:t>
+      </w:r>
+      <w:proofErr w:type="spellEnd"/>
+      <w:r>
+        <w:t xml:space="preserve"> == </w:t>
+      </w:r>
+      <w:proofErr w:type="spellStart"/>
+      <w:r>
+        <w:t>request.auth.uid</w:t>
+      </w:r>
+      <w:proofErr w:type="spellEnd"/>
+      <w:r>
+        <w:t>;</w:t>
+      </w:r>
+    </w:p>
+    <w:p/>
+    <w:p>
+      <w:r>
+        <w:t xml:space="preserve">      </w:t>
+      </w:r>
+      <w:proofErr w:type="gramStart"/>
+      <w:r>
+        <w:t>allow</w:t>
+      </w:r>
+      <w:proofErr w:type="gramEnd"/>
+      <w:r>
+        <w:t xml:space="preserve"> update: if </w:t>
+      </w:r>
+      <w:proofErr w:type="spellStart"/>
+      <w:r>
+        <w:t>isAdmin</w:t>
+      </w:r>
+      <w:proofErr w:type="spellEnd"/>
+      <w:r>
+        <w:t>()</w:t>
+      </w:r>
+    </w:p>
+    <w:p>
+      <w:r>
+        <w:t xml:space="preserve">        || (</w:t>
+      </w:r>
+      <w:proofErr w:type="spellStart"/>
+      <w:proofErr w:type="gramStart"/>
+      <w:r>
+        <w:t>signedIn</w:t>
+      </w:r>
+      <w:proofErr w:type="spellEnd"/>
+      <w:r>
+        <w:t>(</w:t>
+      </w:r>
+      <w:proofErr w:type="gramEnd"/>
+      <w:r>
+        <w:t xml:space="preserve">) &amp;&amp; </w:t>
+      </w:r>
+      <w:proofErr w:type="spellStart"/>
+      <w:r>
+        <w:t>resource.data.vendorId</w:t>
+      </w:r>
+      <w:proofErr w:type="spellEnd"/>
+      <w:r>
+        <w:t xml:space="preserve"> == </w:t>
+      </w:r>
+      <w:proofErr w:type="spellStart"/>
+      <w:r>
+        <w:t>request.auth.uid</w:t>
+      </w:r>
+      <w:proofErr w:type="spellEnd"/>
+      <w:r>
+        <w:t>)</w:t>
+      </w:r>
+    </w:p>
+    <w:p>
+      <w:r>
+        <w:t xml:space="preserve">        || (</w:t>
+      </w:r>
+      <w:proofErr w:type="spellStart"/>
+      <w:proofErr w:type="gramStart"/>
+      <w:r>
+        <w:t>signedIn</w:t>
+      </w:r>
+      <w:proofErr w:type="spellEnd"/>
+      <w:r>
+        <w:t>()</w:t>
+      </w:r>
+      <w:proofErr w:type="gramEnd"/>
+    </w:p>
+    <w:p>
+      <w:r>
+        <w:t xml:space="preserve">            &amp;&amp; </w:t>
+      </w:r>
+      <w:proofErr w:type="spellStart"/>
+      <w:proofErr w:type="gramStart"/>
+      <w:r>
+        <w:t>request.resource.data.diff</w:t>
+      </w:r>
+      <w:proofErr w:type="spellEnd"/>
+      <w:r>
+        <w:t>(</w:t>
+      </w:r>
+      <w:proofErr w:type="spellStart"/>
+      <w:proofErr w:type="gramEnd"/>
+      <w:r>
+        <w:t>resource.data</w:t>
+      </w:r>
+      <w:proofErr w:type="spellEnd"/>
+      <w:r>
+        <w:t>)</w:t>
+      </w:r>
+    </w:p>
+    <w:p>
+      <w:r>
+        <w:t xml:space="preserve">                 .</w:t>
+      </w:r>
+      <w:proofErr w:type="spellStart"/>
+      <w:proofErr w:type="gramStart"/>
+      <w:r>
+        <w:t>affectedKeys</w:t>
+      </w:r>
+      <w:proofErr w:type="spellEnd"/>
+      <w:r>
+        <w:t>(</w:t>
+      </w:r>
+      <w:proofErr w:type="gramEnd"/>
+      <w:r>
+        <w:t>).</w:t>
+      </w:r>
+      <w:proofErr w:type="spellStart"/>
+      <w:r>
+        <w:t>hasOnly</w:t>
+      </w:r>
+      <w:proofErr w:type="spellEnd"/>
+      <w:r>
+        <w:t>(['stock', 'sales']));</w:t>
+      </w:r>
+    </w:p>
+    <w:p/>
+    <w:p>
+      <w:r>
+        <w:t xml:space="preserve">      </w:t>
+      </w:r>
+      <w:proofErr w:type="gramStart"/>
+      <w:r>
+        <w:t>allow</w:t>
+      </w:r>
+      <w:proofErr w:type="gramEnd"/>
+      <w:r>
+        <w:t xml:space="preserve"> delete: if </w:t>
+      </w:r>
+      <w:proofErr w:type="spellStart"/>
+      <w:r>
+        <w:t>isAdmin</w:t>
+      </w:r>
+      <w:proofErr w:type="spellEnd"/>
+      <w:r>
+        <w:t>()</w:t>
+      </w:r>
+    </w:p>
+    <w:p>
+      <w:r>
+        <w:t xml:space="preserve">        || (</w:t>
+      </w:r>
+      <w:proofErr w:type="spellStart"/>
+      <w:proofErr w:type="gramStart"/>
+      <w:r>
+        <w:t>signedIn</w:t>
+      </w:r>
+      <w:proofErr w:type="spellEnd"/>
+      <w:r>
+        <w:t>(</w:t>
+      </w:r>
+      <w:proofErr w:type="gramEnd"/>
+      <w:r>
+        <w:t xml:space="preserve">) &amp;&amp; </w:t>
+      </w:r>
+      <w:proofErr w:type="spellStart"/>
+      <w:r>
+        <w:t>resource.data.vendorId</w:t>
+      </w:r>
+      <w:proofErr w:type="spellEnd"/>
+      <w:r>
+        <w:t xml:space="preserve"> == </w:t>
+      </w:r>
+      <w:proofErr w:type="spellStart"/>
+      <w:r>
+        <w:t>request.auth.uid</w:t>
+      </w:r>
+      <w:proofErr w:type="spellEnd"/>
+      <w:r>
+        <w:t>);</w:t>
+      </w:r>
+    </w:p>
+    <w:p>
+      <w:r>
+        <w:t xml:space="preserve">    }</w:t>
+      </w:r>
+    </w:p>
+    <w:p/>
+    <w:p>
+      <w:r>
+        <w:t xml:space="preserve">    // ---------- vendors (PUBLIC fields only) ----------</w:t>
+      </w:r>
+    </w:p>
+    <w:p>
+      <w:r>
+        <w:t xml:space="preserve">    </w:t>
+      </w:r>
+      <w:proofErr w:type="gramStart"/>
+      <w:r>
+        <w:t>match</w:t>
+      </w:r>
+      <w:proofErr w:type="gramEnd"/>
+      <w:r>
+        <w:t xml:space="preserve"> /vendors/{id} {</w:t>
+      </w:r>
+    </w:p>
+    <w:p>
+      <w:r>
+        <w:t xml:space="preserve">      </w:t>
+      </w:r>
+      <w:proofErr w:type="gramStart"/>
+      <w:r>
+        <w:t>allow</w:t>
+      </w:r>
+      <w:proofErr w:type="gramEnd"/>
+      <w:r>
+        <w:t xml:space="preserve"> read: if true;</w:t>
+      </w:r>
+    </w:p>
+    <w:p>
+      <w:r>
+        <w:t xml:space="preserve">      </w:t>
+      </w:r>
+      <w:proofErr w:type="gramStart"/>
+      <w:r>
+        <w:t>allow</w:t>
+      </w:r>
+      <w:proofErr w:type="gramEnd"/>
+      <w:r>
+        <w:t xml:space="preserve"> create: if </w:t>
+      </w:r>
+      <w:proofErr w:type="spellStart"/>
+      <w:r>
+        <w:t>signedIn</w:t>
+      </w:r>
+      <w:proofErr w:type="spellEnd"/>
+      <w:r>
+        <w:t>()</w:t>
+      </w:r>
+    </w:p>
+    <w:p>
+      <w:r>
+        <w:t xml:space="preserve">        &amp;&amp; </w:t>
+      </w:r>
+      <w:proofErr w:type="spellStart"/>
+      <w:r>
+        <w:t>request.resource.data.uid</w:t>
+      </w:r>
+      <w:proofErr w:type="spellEnd"/>
+      <w:r>
+        <w:t xml:space="preserve"> == </w:t>
+      </w:r>
+      <w:proofErr w:type="spellStart"/>
+      <w:r>
+        <w:t>request.auth.uid</w:t>
+      </w:r>
+      <w:proofErr w:type="spellEnd"/>
+      <w:r>
+        <w:t>;</w:t>
+      </w:r>
+    </w:p>
+    <w:p>
+      <w:r>
+        <w:t xml:space="preserve">      </w:t>
+      </w:r>
+      <w:proofErr w:type="gramStart"/>
+      <w:r>
+        <w:t>allow</w:t>
+      </w:r>
+      <w:proofErr w:type="gramEnd"/>
+      <w:r>
+        <w:t xml:space="preserve"> update: if </w:t>
+      </w:r>
+      <w:proofErr w:type="spellStart"/>
+      <w:r>
+        <w:t>isAdmin</w:t>
+      </w:r>
+      <w:proofErr w:type="spellEnd"/>
+      <w:r>
+        <w:t>()</w:t>
+      </w:r>
+    </w:p>
+    <w:p>
+      <w:r>
+        <w:t xml:space="preserve">        || (</w:t>
+      </w:r>
+      <w:proofErr w:type="spellStart"/>
+      <w:proofErr w:type="gramStart"/>
+      <w:r>
+        <w:t>signedIn</w:t>
+      </w:r>
+      <w:proofErr w:type="spellEnd"/>
+      <w:r>
+        <w:t>(</w:t>
+      </w:r>
+      <w:proofErr w:type="gramEnd"/>
+      <w:r>
+        <w:t xml:space="preserve">) &amp;&amp; </w:t>
+      </w:r>
+      <w:proofErr w:type="spellStart"/>
+      <w:r>
+        <w:t>resource.data.uid</w:t>
+      </w:r>
+      <w:proofErr w:type="spellEnd"/>
+      <w:r>
+        <w:t xml:space="preserve"> == </w:t>
+      </w:r>
+      <w:proofErr w:type="spellStart"/>
+      <w:r>
+        <w:t>request.auth.uid</w:t>
+      </w:r>
+      <w:proofErr w:type="spellEnd"/>
+      <w:r>
+        <w:t>);</w:t>
+      </w:r>
+    </w:p>
+    <w:p>
+      <w:r>
+        <w:t xml:space="preserve">      </w:t>
+      </w:r>
+      <w:proofErr w:type="gramStart"/>
+      <w:r>
+        <w:t>allow</w:t>
+      </w:r>
+      <w:proofErr w:type="gramEnd"/>
+      <w:r>
+        <w:t xml:space="preserve"> delete: if </w:t>
+      </w:r>
+      <w:proofErr w:type="spellStart"/>
+      <w:r>
+        <w:t>isAdmin</w:t>
+      </w:r>
+      <w:proofErr w:type="spellEnd"/>
+      <w:r>
+        <w:t>();</w:t>
+      </w:r>
+    </w:p>
+    <w:p>
+      <w:r>
+        <w:lastRenderedPageBreak/>
+        <w:t xml:space="preserve">    }</w:t>
+      </w:r>
+    </w:p>
+    <w:p/>
+    <w:p>
+      <w:r>
+        <w:t xml:space="preserve">    // ---------- </w:t>
+      </w:r>
+      <w:proofErr w:type="spellStart"/>
+      <w:r>
+        <w:t>vendor_private</w:t>
+      </w:r>
+      <w:proofErr w:type="spellEnd"/>
+      <w:r>
+        <w:t xml:space="preserve"> (bank + KYC) ----------</w:t>
+      </w:r>
+    </w:p>
+    <w:p>
+      <w:r>
+        <w:t xml:space="preserve">    </w:t>
+      </w:r>
+      <w:proofErr w:type="gramStart"/>
+      <w:r>
+        <w:t>match</w:t>
+      </w:r>
+      <w:proofErr w:type="gramEnd"/>
+      <w:r>
+        <w:t xml:space="preserve"> /</w:t>
+      </w:r>
+      <w:proofErr w:type="spellStart"/>
+      <w:r>
+        <w:t>vendor_private</w:t>
+      </w:r>
+      <w:proofErr w:type="spellEnd"/>
+      <w:r>
+        <w:t>/{</w:t>
+      </w:r>
+      <w:proofErr w:type="spellStart"/>
+      <w:r>
+        <w:t>uid</w:t>
+      </w:r>
+      <w:proofErr w:type="spellEnd"/>
+      <w:r>
+        <w:t>} {</w:t>
+      </w:r>
+    </w:p>
+    <w:p>
+      <w:r>
+        <w:t xml:space="preserve">      </w:t>
+      </w:r>
+      <w:proofErr w:type="gramStart"/>
+      <w:r>
+        <w:t>allow</w:t>
+      </w:r>
+      <w:proofErr w:type="gramEnd"/>
+      <w:r>
+        <w:t xml:space="preserve"> read, write: if </w:t>
+      </w:r>
+      <w:proofErr w:type="spellStart"/>
+      <w:r>
+        <w:t>isAdmin</w:t>
+      </w:r>
+      <w:proofErr w:type="spellEnd"/>
+      <w:r>
+        <w:t>()</w:t>
+      </w:r>
+    </w:p>
+    <w:p>
+      <w:r>
+        <w:t xml:space="preserve">        || (</w:t>
+      </w:r>
+      <w:proofErr w:type="spellStart"/>
+      <w:proofErr w:type="gramStart"/>
+      <w:r>
+        <w:t>signedIn</w:t>
+      </w:r>
+      <w:proofErr w:type="spellEnd"/>
+      <w:r>
+        <w:t>(</w:t>
+      </w:r>
+      <w:proofErr w:type="gramEnd"/>
+      <w:r>
+        <w:t xml:space="preserve">) &amp;&amp; </w:t>
+      </w:r>
+      <w:proofErr w:type="spellStart"/>
+      <w:r>
+        <w:t>request.auth.uid</w:t>
+      </w:r>
+      <w:proofErr w:type="spellEnd"/>
+      <w:r>
+        <w:t xml:space="preserve"> == </w:t>
+      </w:r>
+      <w:proofErr w:type="spellStart"/>
+      <w:r>
+        <w:t>uid</w:t>
+      </w:r>
+      <w:proofErr w:type="spellEnd"/>
+      <w:r>
+        <w:t>);</w:t>
+      </w:r>
+    </w:p>
+    <w:p>
+      <w:r>
+        <w:t xml:space="preserve">    }</w:t>
+      </w:r>
+    </w:p>
+    <w:p/>
+    <w:p>
+      <w:r>
+        <w:t xml:space="preserve">    // ---------- users ----------</w:t>
+      </w:r>
+    </w:p>
+    <w:p>
+      <w:r>
+        <w:t xml:space="preserve">    </w:t>
+      </w:r>
+      <w:proofErr w:type="gramStart"/>
+      <w:r>
+        <w:t>match</w:t>
+      </w:r>
+      <w:proofErr w:type="gramEnd"/>
+      <w:r>
+        <w:t xml:space="preserve"> /users/{</w:t>
+      </w:r>
+      <w:proofErr w:type="spellStart"/>
+      <w:r>
+        <w:t>userId</w:t>
+      </w:r>
+      <w:proofErr w:type="spellEnd"/>
+      <w:r>
+        <w:t>} {</w:t>
+      </w:r>
+    </w:p>
+    <w:p>
+      <w:r>
+        <w:t xml:space="preserve">      </w:t>
+      </w:r>
+      <w:proofErr w:type="gramStart"/>
+      <w:r>
+        <w:t>allow</w:t>
+      </w:r>
+      <w:proofErr w:type="gramEnd"/>
+      <w:r>
+        <w:t xml:space="preserve"> read: if </w:t>
+      </w:r>
+      <w:proofErr w:type="spellStart"/>
+      <w:r>
+        <w:t>isAdmin</w:t>
+      </w:r>
+      <w:proofErr w:type="spellEnd"/>
+      <w:r>
+        <w:t>()</w:t>
+      </w:r>
+    </w:p>
+    <w:p>
+      <w:r>
+        <w:t xml:space="preserve">        || (</w:t>
+      </w:r>
+      <w:proofErr w:type="spellStart"/>
+      <w:proofErr w:type="gramStart"/>
+      <w:r>
+        <w:t>signedIn</w:t>
+      </w:r>
+      <w:proofErr w:type="spellEnd"/>
+      <w:r>
+        <w:t>(</w:t>
+      </w:r>
+      <w:proofErr w:type="gramEnd"/>
+      <w:r>
+        <w:t xml:space="preserve">) &amp;&amp; </w:t>
+      </w:r>
+      <w:proofErr w:type="spellStart"/>
+      <w:r>
+        <w:t>request.auth.uid</w:t>
+      </w:r>
+      <w:proofErr w:type="spellEnd"/>
+      <w:r>
+        <w:t xml:space="preserve"> == </w:t>
+      </w:r>
+      <w:proofErr w:type="spellStart"/>
+      <w:r>
+        <w:t>userId</w:t>
+      </w:r>
+      <w:proofErr w:type="spellEnd"/>
+      <w:r>
+        <w:t>);</w:t>
+      </w:r>
+    </w:p>
+    <w:p>
+      <w:r>
+        <w:t xml:space="preserve">      </w:t>
+      </w:r>
+      <w:proofErr w:type="gramStart"/>
+      <w:r>
+        <w:t>allow</w:t>
+      </w:r>
+      <w:proofErr w:type="gramEnd"/>
+      <w:r>
+        <w:t xml:space="preserve"> create: if </w:t>
+      </w:r>
+      <w:proofErr w:type="spellStart"/>
+      <w:r>
+        <w:t>signedIn</w:t>
+      </w:r>
+      <w:proofErr w:type="spellEnd"/>
+      <w:r>
+        <w:t xml:space="preserve">() &amp;&amp; </w:t>
+      </w:r>
+      <w:proofErr w:type="spellStart"/>
+      <w:r>
+        <w:t>request.auth.uid</w:t>
+      </w:r>
+      <w:proofErr w:type="spellEnd"/>
+      <w:r>
+        <w:t xml:space="preserve"> == </w:t>
+      </w:r>
+      <w:proofErr w:type="spellStart"/>
+      <w:r>
+        <w:t>userId</w:t>
+      </w:r>
+      <w:proofErr w:type="spellEnd"/>
+      <w:r>
+        <w:t>;</w:t>
+      </w:r>
+    </w:p>
+    <w:p>
+      <w:r>
+        <w:t xml:space="preserve">      </w:t>
+      </w:r>
+      <w:proofErr w:type="gramStart"/>
+      <w:r>
+        <w:t>allow</w:t>
+      </w:r>
+      <w:proofErr w:type="gramEnd"/>
+      <w:r>
+        <w:t xml:space="preserve"> update: if </w:t>
+      </w:r>
+      <w:proofErr w:type="spellStart"/>
+      <w:r>
+        <w:t>isAdmin</w:t>
+      </w:r>
+      <w:proofErr w:type="spellEnd"/>
+      <w:r>
+        <w:t>()</w:t>
+      </w:r>
+    </w:p>
+    <w:p>
+      <w:r>
+        <w:t xml:space="preserve">        || (</w:t>
+      </w:r>
+      <w:proofErr w:type="spellStart"/>
+      <w:proofErr w:type="gramStart"/>
+      <w:r>
+        <w:t>signedIn</w:t>
+      </w:r>
+      <w:proofErr w:type="spellEnd"/>
+      <w:r>
+        <w:t>(</w:t>
+      </w:r>
+      <w:proofErr w:type="gramEnd"/>
+      <w:r>
+        <w:t xml:space="preserve">) &amp;&amp; </w:t>
+      </w:r>
+      <w:proofErr w:type="spellStart"/>
+      <w:r>
+        <w:t>request.auth.uid</w:t>
+      </w:r>
+      <w:proofErr w:type="spellEnd"/>
+      <w:r>
+        <w:t xml:space="preserve"> == </w:t>
+      </w:r>
+      <w:proofErr w:type="spellStart"/>
+      <w:r>
+        <w:t>userId</w:t>
+      </w:r>
+      <w:proofErr w:type="spellEnd"/>
+      <w:r>
+        <w:t>);</w:t>
+      </w:r>
+    </w:p>
+    <w:p>
+      <w:r>
+        <w:t xml:space="preserve">      </w:t>
+      </w:r>
+      <w:proofErr w:type="gramStart"/>
+      <w:r>
+        <w:t>allow</w:t>
+      </w:r>
+      <w:proofErr w:type="gramEnd"/>
+      <w:r>
+        <w:t xml:space="preserve"> delete: if </w:t>
+      </w:r>
+      <w:proofErr w:type="spellStart"/>
+      <w:r>
+        <w:t>isAdmin</w:t>
+      </w:r>
+      <w:proofErr w:type="spellEnd"/>
+      <w:r>
+        <w:t>();</w:t>
+      </w:r>
+    </w:p>
+    <w:p>
+      <w:r>
+        <w:t xml:space="preserve">    }</w:t>
+      </w:r>
+    </w:p>
+    <w:p/>
+    <w:p>
+      <w:r>
+        <w:t xml:space="preserve">    // ---------- orders ----------</w:t>
+      </w:r>
+    </w:p>
+    <w:p>
+      <w:r>
+        <w:t xml:space="preserve">    </w:t>
+      </w:r>
+      <w:proofErr w:type="gramStart"/>
+      <w:r>
+        <w:t>match</w:t>
+      </w:r>
+      <w:proofErr w:type="gramEnd"/>
+      <w:r>
+        <w:t xml:space="preserve"> /orders/{</w:t>
+      </w:r>
+      <w:proofErr w:type="spellStart"/>
+      <w:r>
+        <w:t>orderId</w:t>
+      </w:r>
+      <w:proofErr w:type="spellEnd"/>
+      <w:r>
+        <w:t>} {</w:t>
+      </w:r>
+    </w:p>
+    <w:p>
+      <w:r>
+        <w:t xml:space="preserve">      </w:t>
+      </w:r>
+      <w:proofErr w:type="gramStart"/>
+      <w:r>
+        <w:t>allow</w:t>
+      </w:r>
+      <w:proofErr w:type="gramEnd"/>
+      <w:r>
+        <w:t xml:space="preserve"> read: if </w:t>
+      </w:r>
+      <w:proofErr w:type="spellStart"/>
+      <w:r>
+        <w:t>isAdmin</w:t>
+      </w:r>
+      <w:proofErr w:type="spellEnd"/>
+      <w:r>
+        <w:t>()</w:t>
+      </w:r>
+    </w:p>
+    <w:p>
+      <w:r>
+        <w:t xml:space="preserve">        || </w:t>
+      </w:r>
+      <w:proofErr w:type="spellStart"/>
+      <w:proofErr w:type="gramStart"/>
+      <w:r>
+        <w:t>isEmailOwner</w:t>
+      </w:r>
+      <w:proofErr w:type="spellEnd"/>
+      <w:r>
+        <w:t>(</w:t>
+      </w:r>
+      <w:proofErr w:type="spellStart"/>
+      <w:proofErr w:type="gramEnd"/>
+      <w:r>
+        <w:t>resource.data.userEmail</w:t>
+      </w:r>
+      <w:proofErr w:type="spellEnd"/>
+      <w:r>
+        <w:t>)</w:t>
+      </w:r>
+    </w:p>
+    <w:p>
+      <w:r>
+        <w:t xml:space="preserve">        || (</w:t>
+      </w:r>
+      <w:proofErr w:type="spellStart"/>
+      <w:proofErr w:type="gramStart"/>
+      <w:r>
+        <w:t>signedIn</w:t>
+      </w:r>
+      <w:proofErr w:type="spellEnd"/>
+      <w:r>
+        <w:t>()</w:t>
+      </w:r>
+      <w:proofErr w:type="gramEnd"/>
+    </w:p>
+    <w:p>
+      <w:r>
+        <w:t xml:space="preserve">            &amp;&amp; '</w:t>
+      </w:r>
+      <w:proofErr w:type="spellStart"/>
+      <w:r>
+        <w:t>vendorIds</w:t>
+      </w:r>
+      <w:proofErr w:type="spellEnd"/>
+      <w:r>
+        <w:t xml:space="preserve">' in </w:t>
+      </w:r>
+      <w:proofErr w:type="spellStart"/>
+      <w:r>
+        <w:t>resource.data</w:t>
+      </w:r>
+      <w:proofErr w:type="spellEnd"/>
+    </w:p>
+    <w:p>
+      <w:r>
+        <w:t xml:space="preserve">            &amp;&amp; </w:t>
+      </w:r>
+      <w:proofErr w:type="spellStart"/>
+      <w:r>
+        <w:t>request.auth.uid</w:t>
+      </w:r>
+      <w:proofErr w:type="spellEnd"/>
+      <w:r>
+        <w:t xml:space="preserve"> in </w:t>
+      </w:r>
+      <w:proofErr w:type="spellStart"/>
+      <w:r>
+        <w:t>resource.data.vendorIds</w:t>
+      </w:r>
+      <w:proofErr w:type="spellEnd"/>
+      <w:r>
+        <w:t>);</w:t>
+      </w:r>
+    </w:p>
+    <w:p/>
+    <w:p>
+      <w:r>
+        <w:t xml:space="preserve">      </w:t>
+      </w:r>
+      <w:proofErr w:type="gramStart"/>
+      <w:r>
+        <w:t>allow</w:t>
+      </w:r>
+      <w:proofErr w:type="gramEnd"/>
+      <w:r>
+        <w:t xml:space="preserve"> create: if </w:t>
+      </w:r>
+      <w:proofErr w:type="spellStart"/>
+      <w:r>
+        <w:t>signedIn</w:t>
+      </w:r>
+      <w:proofErr w:type="spellEnd"/>
+      <w:r>
+        <w:t>()</w:t>
+      </w:r>
+    </w:p>
+    <w:p>
+      <w:r>
+        <w:t xml:space="preserve">        &amp;&amp; </w:t>
+      </w:r>
+      <w:proofErr w:type="spellStart"/>
+      <w:r>
+        <w:t>request.resource.data.userEmail</w:t>
+      </w:r>
+      <w:proofErr w:type="spellEnd"/>
+      <w:r>
+        <w:t xml:space="preserve"> == </w:t>
+      </w:r>
+      <w:proofErr w:type="spellStart"/>
+      <w:r>
+        <w:t>request.auth.token.email</w:t>
+      </w:r>
+      <w:proofErr w:type="spellEnd"/>
+      <w:r>
+        <w:t>;</w:t>
+      </w:r>
+    </w:p>
+    <w:p/>
+    <w:p>
+      <w:r>
+        <w:t xml:space="preserve">      </w:t>
+      </w:r>
+      <w:proofErr w:type="gramStart"/>
+      <w:r>
+        <w:t>allow</w:t>
+      </w:r>
+      <w:proofErr w:type="gramEnd"/>
+      <w:r>
+        <w:t xml:space="preserve"> update: if </w:t>
+      </w:r>
+      <w:proofErr w:type="spellStart"/>
+      <w:r>
+        <w:t>isAdmin</w:t>
+      </w:r>
+      <w:proofErr w:type="spellEnd"/>
+      <w:r>
+        <w:t>()</w:t>
+      </w:r>
+    </w:p>
+    <w:p>
+      <w:r>
+        <w:t xml:space="preserve">        || (</w:t>
+      </w:r>
+      <w:proofErr w:type="spellStart"/>
+      <w:proofErr w:type="gramStart"/>
+      <w:r>
+        <w:t>signedIn</w:t>
+      </w:r>
+      <w:proofErr w:type="spellEnd"/>
+      <w:r>
+        <w:t>()</w:t>
+      </w:r>
+      <w:proofErr w:type="gramEnd"/>
+    </w:p>
+    <w:p>
+      <w:r>
+        <w:t xml:space="preserve">            &amp;&amp; '</w:t>
+      </w:r>
+      <w:proofErr w:type="spellStart"/>
+      <w:r>
+        <w:t>vendorIds</w:t>
+      </w:r>
+      <w:proofErr w:type="spellEnd"/>
+      <w:r>
+        <w:t xml:space="preserve">' in </w:t>
+      </w:r>
+      <w:proofErr w:type="spellStart"/>
+      <w:r>
+        <w:t>resource.data</w:t>
+      </w:r>
+      <w:proofErr w:type="spellEnd"/>
+    </w:p>
+    <w:p>
+      <w:r>
+        <w:t xml:space="preserve">            &amp;&amp; </w:t>
+      </w:r>
+      <w:proofErr w:type="spellStart"/>
+      <w:r>
+        <w:t>request.auth.uid</w:t>
+      </w:r>
+      <w:proofErr w:type="spellEnd"/>
+      <w:r>
+        <w:t xml:space="preserve"> in </w:t>
+      </w:r>
+      <w:proofErr w:type="spellStart"/>
+      <w:r>
+        <w:t>resource.data.vendorIds</w:t>
+      </w:r>
+      <w:proofErr w:type="spellEnd"/>
+      <w:r>
+        <w:t>)</w:t>
+      </w:r>
+    </w:p>
+    <w:p>
+      <w:r>
+        <w:t xml:space="preserve">        || </w:t>
+      </w:r>
+      <w:proofErr w:type="spellStart"/>
+      <w:proofErr w:type="gramStart"/>
+      <w:r>
+        <w:t>isEmailOwner</w:t>
+      </w:r>
+      <w:proofErr w:type="spellEnd"/>
+      <w:r>
+        <w:t>(</w:t>
+      </w:r>
+      <w:proofErr w:type="spellStart"/>
+      <w:proofErr w:type="gramEnd"/>
+      <w:r>
+        <w:t>resource.data.userEmail</w:t>
+      </w:r>
+      <w:proofErr w:type="spellEnd"/>
+      <w:r>
+        <w:t>);</w:t>
+      </w:r>
+    </w:p>
+    <w:p/>
+    <w:p>
+      <w:r>
+        <w:t xml:space="preserve">      </w:t>
+      </w:r>
+      <w:proofErr w:type="gramStart"/>
+      <w:r>
+        <w:t>allow</w:t>
+      </w:r>
+      <w:proofErr w:type="gramEnd"/>
+      <w:r>
+        <w:t xml:space="preserve"> delete: if </w:t>
+      </w:r>
+      <w:proofErr w:type="spellStart"/>
+      <w:r>
+        <w:t>isAdmin</w:t>
+      </w:r>
+      <w:proofErr w:type="spellEnd"/>
+      <w:r>
+        <w:t>();</w:t>
+      </w:r>
+    </w:p>
+    <w:p>
+      <w:r>
+        <w:t xml:space="preserve">    }</w:t>
+      </w:r>
+    </w:p>
+    <w:p/>
+    <w:p>
+      <w:r>
+        <w:t xml:space="preserve">    // ---------- chats ----------</w:t>
+      </w:r>
+    </w:p>
+    <w:p>
+      <w:r>
+        <w:t xml:space="preserve">    </w:t>
+      </w:r>
+      <w:proofErr w:type="gramStart"/>
+      <w:r>
+        <w:t>match</w:t>
+      </w:r>
+      <w:proofErr w:type="gramEnd"/>
+      <w:r>
+        <w:t xml:space="preserve"> /chats/{</w:t>
+      </w:r>
+      <w:proofErr w:type="spellStart"/>
+      <w:r>
+        <w:t>chatId</w:t>
+      </w:r>
+      <w:proofErr w:type="spellEnd"/>
+      <w:r>
+        <w:t>} {</w:t>
+      </w:r>
+    </w:p>
+    <w:p>
+      <w:r>
+        <w:t xml:space="preserve">      </w:t>
+      </w:r>
+      <w:proofErr w:type="gramStart"/>
+      <w:r>
+        <w:t>allow</w:t>
+      </w:r>
+      <w:proofErr w:type="gramEnd"/>
+      <w:r>
+        <w:t xml:space="preserve"> read, update: if </w:t>
+      </w:r>
+      <w:proofErr w:type="spellStart"/>
+      <w:r>
+        <w:t>isAdmin</w:t>
+      </w:r>
+      <w:proofErr w:type="spellEnd"/>
+      <w:r>
+        <w:t>()</w:t>
+      </w:r>
+    </w:p>
+    <w:p>
+      <w:r>
+        <w:t xml:space="preserve">        || </w:t>
+      </w:r>
+      <w:proofErr w:type="spellStart"/>
+      <w:proofErr w:type="gramStart"/>
+      <w:r>
+        <w:t>isEmailOwner</w:t>
+      </w:r>
+      <w:proofErr w:type="spellEnd"/>
+      <w:r>
+        <w:t>(</w:t>
+      </w:r>
+      <w:proofErr w:type="spellStart"/>
+      <w:proofErr w:type="gramEnd"/>
+      <w:r>
+        <w:t>resource.data.customerEmail</w:t>
+      </w:r>
+      <w:proofErr w:type="spellEnd"/>
+      <w:r>
+        <w:t>)</w:t>
+      </w:r>
+    </w:p>
+    <w:p>
+      <w:r>
+        <w:t xml:space="preserve">        || (</w:t>
+      </w:r>
+      <w:proofErr w:type="spellStart"/>
+      <w:proofErr w:type="gramStart"/>
+      <w:r>
+        <w:t>signedIn</w:t>
+      </w:r>
+      <w:proofErr w:type="spellEnd"/>
+      <w:r>
+        <w:t>(</w:t>
+      </w:r>
+      <w:proofErr w:type="gramEnd"/>
+      <w:r>
+        <w:t xml:space="preserve">) &amp;&amp; </w:t>
+      </w:r>
+      <w:proofErr w:type="spellStart"/>
+      <w:r>
+        <w:t>request.auth.uid</w:t>
+      </w:r>
+      <w:proofErr w:type="spellEnd"/>
+      <w:r>
+        <w:t xml:space="preserve"> == </w:t>
+      </w:r>
+      <w:proofErr w:type="spellStart"/>
+      <w:r>
+        <w:t>resource.data.sellerId</w:t>
+      </w:r>
+      <w:proofErr w:type="spellEnd"/>
+      <w:r>
+        <w:t>);</w:t>
+      </w:r>
+    </w:p>
+    <w:p>
+      <w:r>
+        <w:t xml:space="preserve">      </w:t>
+      </w:r>
+      <w:proofErr w:type="gramStart"/>
+      <w:r>
+        <w:t>allow</w:t>
+      </w:r>
+      <w:proofErr w:type="gramEnd"/>
+      <w:r>
+        <w:t xml:space="preserve"> create: if </w:t>
+      </w:r>
+      <w:proofErr w:type="spellStart"/>
+      <w:r>
+        <w:t>signedIn</w:t>
+      </w:r>
+      <w:proofErr w:type="spellEnd"/>
+      <w:r>
+        <w:t>();</w:t>
+      </w:r>
+    </w:p>
+    <w:p>
+      <w:r>
+        <w:t xml:space="preserve">      </w:t>
+      </w:r>
+      <w:proofErr w:type="gramStart"/>
+      <w:r>
+        <w:t>allow</w:t>
+      </w:r>
+      <w:proofErr w:type="gramEnd"/>
+      <w:r>
+        <w:t xml:space="preserve"> delete: if </w:t>
+      </w:r>
+      <w:proofErr w:type="spellStart"/>
+      <w:r>
+        <w:t>isAdmin</w:t>
+      </w:r>
+      <w:proofErr w:type="spellEnd"/>
+      <w:r>
+        <w:t>();</w:t>
+      </w:r>
+    </w:p>
+    <w:p>
+      <w:r>
+        <w:t xml:space="preserve">    }</w:t>
+      </w:r>
+    </w:p>
+    <w:p/>
+    <w:p>
+      <w:r>
+        <w:t xml:space="preserve">    // ---------- messages ----------</w:t>
+      </w:r>
+    </w:p>
+    <w:p>
+      <w:r>
+        <w:t xml:space="preserve">    </w:t>
+      </w:r>
+      <w:proofErr w:type="gramStart"/>
+      <w:r>
+        <w:t>match</w:t>
+      </w:r>
+      <w:proofErr w:type="gramEnd"/>
+      <w:r>
+        <w:t xml:space="preserve"> /messages/{</w:t>
+      </w:r>
+      <w:proofErr w:type="spellStart"/>
+      <w:r>
+        <w:t>messageId</w:t>
+      </w:r>
+      <w:proofErr w:type="spellEnd"/>
+      <w:r>
+        <w:t>} {</w:t>
+      </w:r>
+    </w:p>
+    <w:p>
+      <w:r>
+        <w:t xml:space="preserve">      </w:t>
+      </w:r>
+      <w:proofErr w:type="gramStart"/>
+      <w:r>
+        <w:t>allow</w:t>
+      </w:r>
+      <w:proofErr w:type="gramEnd"/>
+      <w:r>
+        <w:t xml:space="preserve"> read: if </w:t>
+      </w:r>
+      <w:proofErr w:type="spellStart"/>
+      <w:r>
+        <w:t>isAdmin</w:t>
+      </w:r>
+      <w:proofErr w:type="spellEnd"/>
+      <w:r>
+        <w:t>()</w:t>
+      </w:r>
+    </w:p>
+    <w:p>
+      <w:r>
+        <w:lastRenderedPageBreak/>
+        <w:t xml:space="preserve">        || (</w:t>
+      </w:r>
+      <w:proofErr w:type="spellStart"/>
+      <w:proofErr w:type="gramStart"/>
+      <w:r>
+        <w:t>signedIn</w:t>
+      </w:r>
+      <w:proofErr w:type="spellEnd"/>
+      <w:r>
+        <w:t>(</w:t>
+      </w:r>
+      <w:proofErr w:type="gramEnd"/>
+      <w:r>
+        <w:t xml:space="preserve">) &amp;&amp; </w:t>
+      </w:r>
+      <w:proofErr w:type="spellStart"/>
+      <w:r>
+        <w:t>isChatParticipant</w:t>
+      </w:r>
+      <w:proofErr w:type="spellEnd"/>
+      <w:r>
+        <w:t>(</w:t>
+      </w:r>
+      <w:proofErr w:type="spellStart"/>
+      <w:r>
+        <w:t>resource.data.chatId</w:t>
+      </w:r>
+      <w:proofErr w:type="spellEnd"/>
+      <w:r>
+        <w:t>));</w:t>
+      </w:r>
+    </w:p>
+    <w:p>
+      <w:r>
+        <w:t xml:space="preserve">      </w:t>
+      </w:r>
+      <w:proofErr w:type="gramStart"/>
+      <w:r>
+        <w:t>allow</w:t>
+      </w:r>
+      <w:proofErr w:type="gramEnd"/>
+      <w:r>
+        <w:t xml:space="preserve"> create: if </w:t>
+      </w:r>
+      <w:proofErr w:type="spellStart"/>
+      <w:r>
+        <w:t>signedIn</w:t>
+      </w:r>
+      <w:proofErr w:type="spellEnd"/>
+      <w:r>
+        <w:t>()</w:t>
+      </w:r>
+    </w:p>
+    <w:p>
+      <w:r>
+        <w:t xml:space="preserve">        &amp;&amp; </w:t>
+      </w:r>
+      <w:proofErr w:type="spellStart"/>
+      <w:proofErr w:type="gramStart"/>
+      <w:r>
+        <w:t>isChatParticipant</w:t>
+      </w:r>
+      <w:proofErr w:type="spellEnd"/>
+      <w:r>
+        <w:t>(</w:t>
+      </w:r>
+      <w:proofErr w:type="spellStart"/>
+      <w:proofErr w:type="gramEnd"/>
+      <w:r>
+        <w:t>request.resource.data.chatId</w:t>
+      </w:r>
+      <w:proofErr w:type="spellEnd"/>
+      <w:r>
+        <w:t>);</w:t>
+      </w:r>
+    </w:p>
+    <w:p>
+      <w:r>
+        <w:t xml:space="preserve">      </w:t>
+      </w:r>
+      <w:proofErr w:type="gramStart"/>
+      <w:r>
+        <w:t>allow</w:t>
+      </w:r>
+      <w:proofErr w:type="gramEnd"/>
+      <w:r>
+        <w:t xml:space="preserve"> update, delete: if </w:t>
+      </w:r>
+      <w:proofErr w:type="spellStart"/>
+      <w:r>
+        <w:t>isAdmin</w:t>
+      </w:r>
+      <w:proofErr w:type="spellEnd"/>
+      <w:r>
+        <w:t>();</w:t>
+      </w:r>
+    </w:p>
+    <w:p>
+      <w:r>
+        <w:t xml:space="preserve">    }</w:t>
+      </w:r>
+    </w:p>
+    <w:p/>
+    <w:p>
+      <w:r>
+        <w:t xml:space="preserve">    // ---------- coupons (public read so checkout can validate) ----------</w:t>
+      </w:r>
+    </w:p>
+    <w:p>
+      <w:r>
+        <w:t xml:space="preserve">    </w:t>
+      </w:r>
+      <w:proofErr w:type="gramStart"/>
+      <w:r>
+        <w:t>match</w:t>
+      </w:r>
+      <w:proofErr w:type="gramEnd"/>
+      <w:r>
+        <w:t xml:space="preserve"> /coupons/{id} {</w:t>
+      </w:r>
+    </w:p>
+    <w:p>
+      <w:r>
+        <w:t xml:space="preserve">      </w:t>
+      </w:r>
+      <w:proofErr w:type="gramStart"/>
+      <w:r>
+        <w:t>allow</w:t>
+      </w:r>
+      <w:proofErr w:type="gramEnd"/>
+      <w:r>
+        <w:t xml:space="preserve"> read: if true;</w:t>
+      </w:r>
+    </w:p>
+    <w:p>
+      <w:r>
+        <w:t xml:space="preserve">      </w:t>
+      </w:r>
+      <w:proofErr w:type="gramStart"/>
+      <w:r>
+        <w:t>allow</w:t>
+      </w:r>
+      <w:proofErr w:type="gramEnd"/>
+      <w:r>
+        <w:t xml:space="preserve"> write: if </w:t>
+      </w:r>
+      <w:proofErr w:type="spellStart"/>
+      <w:r>
+        <w:t>isAdmin</w:t>
+      </w:r>
+      <w:proofErr w:type="spellEnd"/>
+      <w:r>
+        <w:t>();</w:t>
+      </w:r>
+    </w:p>
+    <w:p>
+      <w:r>
+        <w:t xml:space="preserve">    }</w:t>
+      </w:r>
+    </w:p>
+    <w:p/>
+    <w:p>
+      <w:r>
+        <w:t xml:space="preserve">    // ---------- vendor payouts (admin only) ----------</w:t>
+      </w:r>
+    </w:p>
+    <w:p>
+      <w:r>
+        <w:t xml:space="preserve">    </w:t>
+      </w:r>
+      <w:proofErr w:type="gramStart"/>
+      <w:r>
+        <w:t>match</w:t>
+      </w:r>
+      <w:proofErr w:type="gramEnd"/>
+      <w:r>
+        <w:t xml:space="preserve"> /</w:t>
+      </w:r>
+      <w:proofErr w:type="spellStart"/>
+      <w:r>
+        <w:t>vendor_payouts</w:t>
+      </w:r>
+      <w:proofErr w:type="spellEnd"/>
+      <w:r>
+        <w:t>/{id} {</w:t>
+      </w:r>
+    </w:p>
+    <w:p>
+      <w:r>
+        <w:t xml:space="preserve">      </w:t>
+      </w:r>
+      <w:proofErr w:type="gramStart"/>
+      <w:r>
+        <w:t>allow</w:t>
+      </w:r>
+      <w:proofErr w:type="gramEnd"/>
+      <w:r>
+        <w:t xml:space="preserve"> read, write: if </w:t>
+      </w:r>
+      <w:proofErr w:type="spellStart"/>
+      <w:r>
+        <w:t>isAdmin</w:t>
+      </w:r>
+      <w:proofErr w:type="spellEnd"/>
+      <w:r>
+        <w:t>();</w:t>
+      </w:r>
+    </w:p>
+    <w:p>
+      <w:r>
+        <w:t xml:space="preserve">    }</w:t>
+      </w:r>
+    </w:p>
+    <w:p/>
+    <w:p>
+      <w:r>
+        <w:t xml:space="preserve">    // ---------- notifications ----------</w:t>
+      </w:r>
+    </w:p>
+    <w:p>
+      <w:r>
+        <w:t xml:space="preserve">    </w:t>
+      </w:r>
+      <w:proofErr w:type="gramStart"/>
+      <w:r>
+        <w:t>match</w:t>
+      </w:r>
+      <w:proofErr w:type="gramEnd"/>
+      <w:r>
+        <w:t xml:space="preserve"> /notifications/{id} {</w:t>
+      </w:r>
+    </w:p>
+    <w:p>
+      <w:r>
+        <w:t xml:space="preserve">      </w:t>
+      </w:r>
+      <w:proofErr w:type="gramStart"/>
+      <w:r>
+        <w:t>allow</w:t>
+      </w:r>
+      <w:proofErr w:type="gramEnd"/>
+      <w:r>
+        <w:t xml:space="preserve"> read, write: if </w:t>
+      </w:r>
+      <w:proofErr w:type="spellStart"/>
+      <w:r>
+        <w:t>signedIn</w:t>
+      </w:r>
+      <w:proofErr w:type="spellEnd"/>
+      <w:r>
+        <w:t>();</w:t>
+      </w:r>
+    </w:p>
+    <w:p>
+      <w:r>
+        <w:t xml:space="preserve">    }</w:t>
+      </w:r>
+    </w:p>
+    <w:p/>
+    <w:p>
+      <w:r>
+        <w:t xml:space="preserve">    // ---------- product questions &amp; reviews ----------</w:t>
+      </w:r>
+    </w:p>
+    <w:p>
+      <w:r>
+        <w:t xml:space="preserve">    </w:t>
+      </w:r>
+      <w:proofErr w:type="gramStart"/>
+      <w:r>
+        <w:t>match</w:t>
+      </w:r>
+      <w:proofErr w:type="gramEnd"/>
+      <w:r>
+        <w:t xml:space="preserve"> /</w:t>
+      </w:r>
+      <w:proofErr w:type="spellStart"/>
+      <w:r>
+        <w:t>productQuestions</w:t>
+      </w:r>
+      <w:proofErr w:type="spellEnd"/>
+      <w:r>
+        <w:t>/{id} {</w:t>
+      </w:r>
+    </w:p>
+    <w:p>
+      <w:r>
+        <w:t xml:space="preserve">      </w:t>
+      </w:r>
+      <w:proofErr w:type="gramStart"/>
+      <w:r>
+        <w:t>allow</w:t>
+      </w:r>
+      <w:proofErr w:type="gramEnd"/>
+      <w:r>
+        <w:t xml:space="preserve"> read: if true;</w:t>
+      </w:r>
+    </w:p>
+    <w:p>
+      <w:r>
+        <w:lastRenderedPageBreak/>
+        <w:t xml:space="preserve">      </w:t>
+      </w:r>
+      <w:proofErr w:type="gramStart"/>
+      <w:r>
+        <w:t>allow</w:t>
+      </w:r>
+      <w:proofErr w:type="gramEnd"/>
+      <w:r>
+        <w:t xml:space="preserve"> create: if </w:t>
+      </w:r>
+      <w:proofErr w:type="spellStart"/>
+      <w:r>
+        <w:t>signedIn</w:t>
+      </w:r>
+      <w:proofErr w:type="spellEnd"/>
+      <w:r>
+        <w:t>();</w:t>
+      </w:r>
+    </w:p>
+    <w:p>
+      <w:r>
+        <w:t xml:space="preserve">      </w:t>
+      </w:r>
+      <w:proofErr w:type="gramStart"/>
+      <w:r>
+        <w:t>allow</w:t>
+      </w:r>
+      <w:proofErr w:type="gramEnd"/>
+      <w:r>
+        <w:t xml:space="preserve"> update, delete: if </w:t>
+      </w:r>
+      <w:proofErr w:type="spellStart"/>
+      <w:r>
+        <w:t>isAdmin</w:t>
+      </w:r>
+      <w:proofErr w:type="spellEnd"/>
+      <w:r>
+        <w:t>();</w:t>
+      </w:r>
+    </w:p>
+    <w:p>
+      <w:r>
+        <w:t xml:space="preserve">    }</w:t>
+      </w:r>
+    </w:p>
+    <w:p>
+      <w:r>
+        <w:t xml:space="preserve">    </w:t>
+      </w:r>
+      <w:proofErr w:type="gramStart"/>
+      <w:r>
+        <w:t>match</w:t>
+      </w:r>
+      <w:proofErr w:type="gramEnd"/>
+      <w:r>
+        <w:t xml:space="preserve"> /</w:t>
+      </w:r>
+      <w:proofErr w:type="spellStart"/>
+      <w:r>
+        <w:t>productReviews</w:t>
+      </w:r>
+      <w:proofErr w:type="spellEnd"/>
+      <w:r>
+        <w:t>/{id} {</w:t>
+      </w:r>
+    </w:p>
+    <w:p>
+      <w:r>
+        <w:t xml:space="preserve">      </w:t>
+      </w:r>
+      <w:proofErr w:type="gramStart"/>
+      <w:r>
+        <w:t>allow</w:t>
+      </w:r>
+      <w:proofErr w:type="gramEnd"/>
+      <w:r>
+        <w:t xml:space="preserve"> read: if true;</w:t>
+      </w:r>
+    </w:p>
+    <w:p>
+      <w:r>
+        <w:t xml:space="preserve">      </w:t>
+      </w:r>
+      <w:proofErr w:type="gramStart"/>
+      <w:r>
+        <w:t>allow</w:t>
+      </w:r>
+      <w:proofErr w:type="gramEnd"/>
+      <w:r>
+        <w:t xml:space="preserve"> create: if </w:t>
+      </w:r>
+      <w:proofErr w:type="spellStart"/>
+      <w:r>
+        <w:t>signedIn</w:t>
+      </w:r>
+      <w:proofErr w:type="spellEnd"/>
+      <w:r>
+        <w:t>();</w:t>
+      </w:r>
+    </w:p>
+    <w:p>
+      <w:r>
+        <w:t xml:space="preserve">      </w:t>
+      </w:r>
+      <w:proofErr w:type="gramStart"/>
+      <w:r>
+        <w:t>allow</w:t>
+      </w:r>
+      <w:proofErr w:type="gramEnd"/>
+      <w:r>
+        <w:t xml:space="preserve"> update, delete: if </w:t>
+      </w:r>
+      <w:proofErr w:type="spellStart"/>
+      <w:r>
+        <w:t>isAdmin</w:t>
+      </w:r>
+      <w:proofErr w:type="spellEnd"/>
+      <w:r>
+        <w:t>();</w:t>
+      </w:r>
+    </w:p>
+    <w:p>
+      <w:r>
+        <w:t xml:space="preserve">    }</w:t>
+      </w:r>
+    </w:p>
+    <w:p/>
+    <w:p>
+      <w:r>
+        <w:t xml:space="preserve">    // ---------- reward transactions ----------</w:t>
+      </w:r>
+    </w:p>
+    <w:p>
+      <w:r>
+        <w:t xml:space="preserve">    </w:t>
+      </w:r>
+      <w:proofErr w:type="gramStart"/>
+      <w:r>
+        <w:t>match</w:t>
+      </w:r>
+      <w:proofErr w:type="gramEnd"/>
+      <w:r>
+        <w:t xml:space="preserve"> /</w:t>
+      </w:r>
+      <w:proofErr w:type="spellStart"/>
+      <w:r>
+        <w:t>rewardTransactions</w:t>
+      </w:r>
+      <w:proofErr w:type="spellEnd"/>
+      <w:r>
+        <w:t>/{id} {</w:t>
+      </w:r>
+    </w:p>
+    <w:p>
+      <w:r>
+        <w:t xml:space="preserve">      </w:t>
+      </w:r>
+      <w:proofErr w:type="gramStart"/>
+      <w:r>
+        <w:t>allow</w:t>
+      </w:r>
+      <w:proofErr w:type="gramEnd"/>
+      <w:r>
+        <w:t xml:space="preserve"> read: if </w:t>
+      </w:r>
+      <w:proofErr w:type="spellStart"/>
+      <w:r>
+        <w:t>isAdmin</w:t>
+      </w:r>
+      <w:proofErr w:type="spellEnd"/>
+      <w:r>
+        <w:t>()</w:t>
+      </w:r>
+    </w:p>
+    <w:p>
+      <w:r>
+        <w:t xml:space="preserve">        || (</w:t>
+      </w:r>
+      <w:proofErr w:type="spellStart"/>
+      <w:proofErr w:type="gramStart"/>
+      <w:r>
+        <w:t>signedIn</w:t>
+      </w:r>
+      <w:proofErr w:type="spellEnd"/>
+      <w:r>
+        <w:t>(</w:t>
+      </w:r>
+      <w:proofErr w:type="gramEnd"/>
+      <w:r>
+        <w:t xml:space="preserve">) &amp;&amp; </w:t>
+      </w:r>
+      <w:proofErr w:type="spellStart"/>
+      <w:r>
+        <w:t>resource.data.userId</w:t>
+      </w:r>
+      <w:proofErr w:type="spellEnd"/>
+      <w:r>
+        <w:t xml:space="preserve"> == </w:t>
+      </w:r>
+      <w:proofErr w:type="spellStart"/>
+      <w:r>
+        <w:t>request.auth.uid</w:t>
+      </w:r>
+      <w:proofErr w:type="spellEnd"/>
+      <w:r>
+        <w:t>);</w:t>
+      </w:r>
+    </w:p>
+    <w:p>
+      <w:r>
+        <w:t xml:space="preserve">      </w:t>
+      </w:r>
+      <w:proofErr w:type="gramStart"/>
+      <w:r>
+        <w:t>allow</w:t>
+      </w:r>
+      <w:proofErr w:type="gramEnd"/>
+      <w:r>
+        <w:t xml:space="preserve"> create: if </w:t>
+      </w:r>
+      <w:proofErr w:type="spellStart"/>
+      <w:r>
+        <w:t>signedIn</w:t>
+      </w:r>
+      <w:proofErr w:type="spellEnd"/>
+      <w:r>
+        <w:t>();</w:t>
+      </w:r>
+    </w:p>
+    <w:p>
+      <w:r>
+        <w:t xml:space="preserve">    }</w:t>
+      </w:r>
+    </w:p>
+    <w:p/>
+    <w:p>
+      <w:r>
+        <w:t xml:space="preserve">    // ---------- refunds (adjust to your schema) ----------</w:t>
+      </w:r>
+    </w:p>
+    <w:p>
+      <w:r>
+        <w:t xml:space="preserve">    </w:t>
+      </w:r>
+      <w:proofErr w:type="gramStart"/>
+      <w:r>
+        <w:t>match</w:t>
+      </w:r>
+      <w:proofErr w:type="gramEnd"/>
+      <w:r>
+        <w:t xml:space="preserve"> /refunds/{id} {</w:t>
+      </w:r>
+    </w:p>
+    <w:p>
+      <w:r>
+        <w:t xml:space="preserve">      </w:t>
+      </w:r>
+      <w:proofErr w:type="gramStart"/>
+      <w:r>
+        <w:t>allow</w:t>
+      </w:r>
+      <w:proofErr w:type="gramEnd"/>
+      <w:r>
+        <w:t xml:space="preserve"> read: if </w:t>
+      </w:r>
+      <w:proofErr w:type="spellStart"/>
+      <w:r>
+        <w:t>isAdmin</w:t>
+      </w:r>
+      <w:proofErr w:type="spellEnd"/>
+      <w:r>
+        <w:t xml:space="preserve">() || </w:t>
+      </w:r>
+      <w:proofErr w:type="spellStart"/>
+      <w:r>
+        <w:t>isEmailOwner</w:t>
+      </w:r>
+      <w:proofErr w:type="spellEnd"/>
+      <w:r>
+        <w:t>(</w:t>
+      </w:r>
+      <w:proofErr w:type="spellStart"/>
+      <w:r>
+        <w:t>resource.data.userEmail</w:t>
+      </w:r>
+      <w:proofErr w:type="spellEnd"/>
+      <w:r>
+        <w:t>);</w:t>
+      </w:r>
+    </w:p>
+    <w:p>
+      <w:r>
+        <w:t xml:space="preserve">      </w:t>
+      </w:r>
+      <w:proofErr w:type="gramStart"/>
+      <w:r>
+        <w:t>allow</w:t>
+      </w:r>
+      <w:proofErr w:type="gramEnd"/>
+      <w:r>
+        <w:t xml:space="preserve"> create: if </w:t>
+      </w:r>
+      <w:proofErr w:type="spellStart"/>
+      <w:r>
+        <w:t>signedIn</w:t>
+      </w:r>
+      <w:proofErr w:type="spellEnd"/>
+      <w:r>
+        <w:t>();</w:t>
+      </w:r>
+    </w:p>
+    <w:p>
+      <w:r>
+        <w:t xml:space="preserve">      </w:t>
+      </w:r>
+      <w:proofErr w:type="gramStart"/>
+      <w:r>
+        <w:t>allow</w:t>
+      </w:r>
+      <w:proofErr w:type="gramEnd"/>
+      <w:r>
+        <w:t xml:space="preserve"> update, delete: if </w:t>
+      </w:r>
+      <w:proofErr w:type="spellStart"/>
+      <w:r>
+        <w:t>isAdmin</w:t>
+      </w:r>
+      <w:proofErr w:type="spellEnd"/>
+      <w:r>
+        <w:t>();</w:t>
+      </w:r>
+    </w:p>
+    <w:p>
+      <w:r>
+        <w:t xml:space="preserve">    }</w:t>
+      </w:r>
+    </w:p>
+    <w:p/>
+    <w:p>
+      <w:r>
+        <w:t xml:space="preserve">    // ---------- default deny everything else ----------</w:t>
+      </w:r>
+    </w:p>
+    <w:p>
+      <w:r>
+        <w:t xml:space="preserve">    </w:t>
+      </w:r>
+      <w:proofErr w:type="gramStart"/>
+      <w:r>
+        <w:t>match</w:t>
+      </w:r>
+      <w:proofErr w:type="gramEnd"/>
+      <w:r>
+        <w:t xml:space="preserve"> /{document=**} {</w:t>
+      </w:r>
+    </w:p>
+    <w:p>
+      <w:r>
+        <w:lastRenderedPageBreak/>
+        <w:t xml:space="preserve">      </w:t>
+      </w:r>
+      <w:proofErr w:type="gramStart"/>
+      <w:r>
+        <w:t>allow</w:t>
+      </w:r>
+      <w:proofErr w:type="gramEnd"/>
+      <w:r>
+        <w:t xml:space="preserve"> read, write: if false;</w:t>
+      </w:r>
+    </w:p>
+    <w:p>
+      <w:r>
+        <w:t xml:space="preserve">    }</w:t>
+      </w:r>
+    </w:p>
+    <w:p>
+      <w:r>
+        <w:t xml:space="preserve">  }</w:t>
+      </w:r>
+    </w:p>
+    <w:p>
+      <w:r>
+        <w:t>}</w:t>
+      </w:r>
     </w:p>
     <w:p/>
     <w:p/>

</xml_diff>